<commit_message>
apply P_diff and PWV2IWP
</commit_message>
<xml_diff>
--- a/Code/ACT/results/am results.docx
+++ b/Code/ACT/results/am results.docx
@@ -15,6 +15,9 @@
         <w:ind w:firstLine="480"/>
       </w:pPr>
       <w:r>
+        <w:rPr>
+          <w:noProof/>
+        </w:rPr>
         <w:drawing>
           <wp:inline distT="0" distB="0" distL="0" distR="0" wp14:anchorId="30AA7E96" wp14:editId="636885A8">
             <wp:extent cx="5274310" cy="2966720"/>
@@ -63,6 +66,9 @@
         <w:ind w:firstLine="480"/>
       </w:pPr>
       <w:r>
+        <w:rPr>
+          <w:noProof/>
+        </w:rPr>
         <w:drawing>
           <wp:inline distT="0" distB="0" distL="0" distR="0" wp14:anchorId="58A436CB" wp14:editId="2E0A4E97">
             <wp:extent cx="5274310" cy="2966720"/>
@@ -143,15 +149,7 @@
       </w:pPr>
       <w:r>
         <w:lastRenderedPageBreak/>
-        <w:t xml:space="preserve">ACT data for different </w:t>
-      </w:r>
-      <w:proofErr w:type="spellStart"/>
-      <w:r>
-        <w:t>Tbase</w:t>
-      </w:r>
-      <w:proofErr w:type="spellEnd"/>
-      <w:r>
-        <w:t xml:space="preserve"> for each layer, with different PWV</w:t>
+        <w:t>ACT data for different Tbase for each layer, with different PWV</w:t>
       </w:r>
     </w:p>
     <w:p>
@@ -160,6 +158,9 @@
         <w:jc w:val="left"/>
       </w:pPr>
       <w:r>
+        <w:rPr>
+          <w:noProof/>
+        </w:rPr>
         <w:drawing>
           <wp:inline distT="0" distB="0" distL="0" distR="0" wp14:anchorId="7500FACD" wp14:editId="793C3393">
             <wp:extent cx="5274310" cy="2966720"/>
@@ -208,6 +209,9 @@
         <w:ind w:firstLine="480"/>
       </w:pPr>
       <w:r>
+        <w:rPr>
+          <w:noProof/>
+        </w:rPr>
         <w:drawing>
           <wp:inline distT="0" distB="0" distL="0" distR="0" wp14:anchorId="572588C7" wp14:editId="52A9A5C8">
             <wp:extent cx="5274310" cy="2966720"/>
@@ -251,6 +255,9 @@
         </w:drawing>
       </w:r>
       <w:r>
+        <w:rPr>
+          <w:noProof/>
+        </w:rPr>
         <w:lastRenderedPageBreak/>
         <w:drawing>
           <wp:inline distT="0" distB="0" distL="0" distR="0" wp14:anchorId="0694F93A" wp14:editId="32F8E801">
@@ -295,6 +302,9 @@
         </w:drawing>
       </w:r>
       <w:r>
+        <w:rPr>
+          <w:noProof/>
+        </w:rPr>
         <w:drawing>
           <wp:inline distT="0" distB="0" distL="0" distR="0" wp14:anchorId="0A0E7E28" wp14:editId="34342E05">
             <wp:extent cx="5274310" cy="2966720"/>
@@ -315,6 +325,296 @@
                       <a:extLst>
                         <a:ext uri="{96DAC541-7B7A-43D3-8B79-37D633B846F1}">
                           <asvg:svgBlip xmlns:asvg="http://schemas.microsoft.com/office/drawing/2016/SVG/main" r:embed="rId15"/>
+                        </a:ext>
+                      </a:extLst>
+                    </a:blip>
+                    <a:stretch>
+                      <a:fillRect/>
+                    </a:stretch>
+                  </pic:blipFill>
+                  <pic:spPr>
+                    <a:xfrm>
+                      <a:off x="0" y="0"/>
+                      <a:ext cx="5274310" cy="2966720"/>
+                    </a:xfrm>
+                    <a:prstGeom prst="rect">
+                      <a:avLst/>
+                    </a:prstGeom>
+                  </pic:spPr>
+                </pic:pic>
+              </a:graphicData>
+            </a:graphic>
+          </wp:inline>
+        </w:drawing>
+      </w:r>
+    </w:p>
+    <w:p>
+      <w:pPr>
+        <w:widowControl/>
+        <w:spacing w:after="160" w:line="259" w:lineRule="auto"/>
+        <w:ind w:firstLineChars="0" w:firstLine="0"/>
+        <w:jc w:val="left"/>
+      </w:pPr>
+      <w:r>
+        <w:br w:type="page"/>
+      </w:r>
+    </w:p>
+    <w:p>
+      <w:pPr>
+        <w:ind w:firstLine="480"/>
+      </w:pPr>
+      <w:r>
+        <w:lastRenderedPageBreak/>
+        <w:t>Different percentage pressure with different PWV</w:t>
+      </w:r>
+    </w:p>
+    <w:p>
+      <w:pPr>
+        <w:ind w:firstLine="480"/>
+      </w:pPr>
+      <w:r>
+        <w:rPr>
+          <w:noProof/>
+          <w14:ligatures w14:val="standardContextual"/>
+        </w:rPr>
+        <w:drawing>
+          <wp:inline distT="0" distB="0" distL="0" distR="0" wp14:anchorId="5A657E05" wp14:editId="1A79E0D8">
+            <wp:extent cx="5274310" cy="2966720"/>
+            <wp:effectExtent l="0" t="0" r="2540" b="5080"/>
+            <wp:docPr id="214159850" name="Graphic 1"/>
+            <wp:cNvGraphicFramePr>
+              <a:graphicFrameLocks xmlns:a="http://schemas.openxmlformats.org/drawingml/2006/main" noChangeAspect="1"/>
+            </wp:cNvGraphicFramePr>
+            <a:graphic xmlns:a="http://schemas.openxmlformats.org/drawingml/2006/main">
+              <a:graphicData uri="http://schemas.openxmlformats.org/drawingml/2006/picture">
+                <pic:pic xmlns:pic="http://schemas.openxmlformats.org/drawingml/2006/picture">
+                  <pic:nvPicPr>
+                    <pic:cNvPr id="214159850" name=""/>
+                    <pic:cNvPicPr/>
+                  </pic:nvPicPr>
+                  <pic:blipFill>
+                    <a:blip r:embed="rId16">
+                      <a:extLst>
+                        <a:ext uri="{96DAC541-7B7A-43D3-8B79-37D633B846F1}">
+                          <asvg:svgBlip xmlns:asvg="http://schemas.microsoft.com/office/drawing/2016/SVG/main" r:embed="rId17"/>
+                        </a:ext>
+                      </a:extLst>
+                    </a:blip>
+                    <a:stretch>
+                      <a:fillRect/>
+                    </a:stretch>
+                  </pic:blipFill>
+                  <pic:spPr>
+                    <a:xfrm>
+                      <a:off x="0" y="0"/>
+                      <a:ext cx="5274310" cy="2966720"/>
+                    </a:xfrm>
+                    <a:prstGeom prst="rect">
+                      <a:avLst/>
+                    </a:prstGeom>
+                  </pic:spPr>
+                </pic:pic>
+              </a:graphicData>
+            </a:graphic>
+          </wp:inline>
+        </w:drawing>
+      </w:r>
+    </w:p>
+    <w:p>
+      <w:pPr>
+        <w:ind w:firstLine="480"/>
+      </w:pPr>
+      <w:r>
+        <w:rPr>
+          <w:noProof/>
+          <w14:ligatures w14:val="standardContextual"/>
+        </w:rPr>
+        <w:drawing>
+          <wp:inline distT="0" distB="0" distL="0" distR="0" wp14:anchorId="7FE99C95" wp14:editId="4028ECB3">
+            <wp:extent cx="5274310" cy="2966720"/>
+            <wp:effectExtent l="0" t="0" r="2540" b="5080"/>
+            <wp:docPr id="369292753" name="Graphic 4"/>
+            <wp:cNvGraphicFramePr>
+              <a:graphicFrameLocks xmlns:a="http://schemas.openxmlformats.org/drawingml/2006/main" noChangeAspect="1"/>
+            </wp:cNvGraphicFramePr>
+            <a:graphic xmlns:a="http://schemas.openxmlformats.org/drawingml/2006/main">
+              <a:graphicData uri="http://schemas.openxmlformats.org/drawingml/2006/picture">
+                <pic:pic xmlns:pic="http://schemas.openxmlformats.org/drawingml/2006/picture">
+                  <pic:nvPicPr>
+                    <pic:cNvPr id="369292753" name=""/>
+                    <pic:cNvPicPr/>
+                  </pic:nvPicPr>
+                  <pic:blipFill>
+                    <a:blip r:embed="rId18">
+                      <a:extLst>
+                        <a:ext uri="{96DAC541-7B7A-43D3-8B79-37D633B846F1}">
+                          <asvg:svgBlip xmlns:asvg="http://schemas.microsoft.com/office/drawing/2016/SVG/main" r:embed="rId19"/>
+                        </a:ext>
+                      </a:extLst>
+                    </a:blip>
+                    <a:stretch>
+                      <a:fillRect/>
+                    </a:stretch>
+                  </pic:blipFill>
+                  <pic:spPr>
+                    <a:xfrm>
+                      <a:off x="0" y="0"/>
+                      <a:ext cx="5274310" cy="2966720"/>
+                    </a:xfrm>
+                    <a:prstGeom prst="rect">
+                      <a:avLst/>
+                    </a:prstGeom>
+                  </pic:spPr>
+                </pic:pic>
+              </a:graphicData>
+            </a:graphic>
+          </wp:inline>
+        </w:drawing>
+      </w:r>
+      <w:r>
+        <w:rPr>
+          <w:noProof/>
+          <w14:ligatures w14:val="standardContextual"/>
+        </w:rPr>
+        <w:lastRenderedPageBreak/>
+        <w:drawing>
+          <wp:inline distT="0" distB="0" distL="0" distR="0" wp14:anchorId="7D0D7081" wp14:editId="07A21122">
+            <wp:extent cx="5274310" cy="2966720"/>
+            <wp:effectExtent l="0" t="0" r="2540" b="5080"/>
+            <wp:docPr id="1888385551" name="Graphic 3"/>
+            <wp:cNvGraphicFramePr>
+              <a:graphicFrameLocks xmlns:a="http://schemas.openxmlformats.org/drawingml/2006/main" noChangeAspect="1"/>
+            </wp:cNvGraphicFramePr>
+            <a:graphic xmlns:a="http://schemas.openxmlformats.org/drawingml/2006/main">
+              <a:graphicData uri="http://schemas.openxmlformats.org/drawingml/2006/picture">
+                <pic:pic xmlns:pic="http://schemas.openxmlformats.org/drawingml/2006/picture">
+                  <pic:nvPicPr>
+                    <pic:cNvPr id="1888385551" name=""/>
+                    <pic:cNvPicPr/>
+                  </pic:nvPicPr>
+                  <pic:blipFill>
+                    <a:blip r:embed="rId20">
+                      <a:extLst>
+                        <a:ext uri="{96DAC541-7B7A-43D3-8B79-37D633B846F1}">
+                          <asvg:svgBlip xmlns:asvg="http://schemas.microsoft.com/office/drawing/2016/SVG/main" r:embed="rId21"/>
+                        </a:ext>
+                      </a:extLst>
+                    </a:blip>
+                    <a:stretch>
+                      <a:fillRect/>
+                    </a:stretch>
+                  </pic:blipFill>
+                  <pic:spPr>
+                    <a:xfrm>
+                      <a:off x="0" y="0"/>
+                      <a:ext cx="5274310" cy="2966720"/>
+                    </a:xfrm>
+                    <a:prstGeom prst="rect">
+                      <a:avLst/>
+                    </a:prstGeom>
+                  </pic:spPr>
+                </pic:pic>
+              </a:graphicData>
+            </a:graphic>
+          </wp:inline>
+        </w:drawing>
+      </w:r>
+      <w:r>
+        <w:rPr>
+          <w:noProof/>
+          <w14:ligatures w14:val="standardContextual"/>
+        </w:rPr>
+        <w:drawing>
+          <wp:inline distT="0" distB="0" distL="0" distR="0" wp14:anchorId="6F77FA06" wp14:editId="68BFAC9E">
+            <wp:extent cx="5274310" cy="2966720"/>
+            <wp:effectExtent l="0" t="0" r="2540" b="5080"/>
+            <wp:docPr id="1303640121" name="Graphic 2"/>
+            <wp:cNvGraphicFramePr>
+              <a:graphicFrameLocks xmlns:a="http://schemas.openxmlformats.org/drawingml/2006/main" noChangeAspect="1"/>
+            </wp:cNvGraphicFramePr>
+            <a:graphic xmlns:a="http://schemas.openxmlformats.org/drawingml/2006/main">
+              <a:graphicData uri="http://schemas.openxmlformats.org/drawingml/2006/picture">
+                <pic:pic xmlns:pic="http://schemas.openxmlformats.org/drawingml/2006/picture">
+                  <pic:nvPicPr>
+                    <pic:cNvPr id="1303640121" name=""/>
+                    <pic:cNvPicPr/>
+                  </pic:nvPicPr>
+                  <pic:blipFill>
+                    <a:blip r:embed="rId22">
+                      <a:extLst>
+                        <a:ext uri="{96DAC541-7B7A-43D3-8B79-37D633B846F1}">
+                          <asvg:svgBlip xmlns:asvg="http://schemas.microsoft.com/office/drawing/2016/SVG/main" r:embed="rId23"/>
+                        </a:ext>
+                      </a:extLst>
+                    </a:blip>
+                    <a:stretch>
+                      <a:fillRect/>
+                    </a:stretch>
+                  </pic:blipFill>
+                  <pic:spPr>
+                    <a:xfrm>
+                      <a:off x="0" y="0"/>
+                      <a:ext cx="5274310" cy="2966720"/>
+                    </a:xfrm>
+                    <a:prstGeom prst="rect">
+                      <a:avLst/>
+                    </a:prstGeom>
+                  </pic:spPr>
+                </pic:pic>
+              </a:graphicData>
+            </a:graphic>
+          </wp:inline>
+        </w:drawing>
+      </w:r>
+    </w:p>
+    <w:p>
+      <w:pPr>
+        <w:widowControl/>
+        <w:spacing w:after="160" w:line="259" w:lineRule="auto"/>
+        <w:ind w:firstLineChars="0" w:firstLine="0"/>
+        <w:jc w:val="left"/>
+      </w:pPr>
+      <w:r>
+        <w:br w:type="page"/>
+      </w:r>
+    </w:p>
+    <w:p>
+      <w:pPr>
+        <w:ind w:firstLine="480"/>
+      </w:pPr>
+      <w:r>
+        <w:lastRenderedPageBreak/>
+        <w:t xml:space="preserve">All </w:t>
+      </w:r>
+      <w:r>
+        <w:t>IWP</w:t>
+      </w:r>
+    </w:p>
+    <w:p>
+      <w:pPr>
+        <w:ind w:firstLine="480"/>
+      </w:pPr>
+      <w:r>
+        <w:drawing>
+          <wp:inline distT="0" distB="0" distL="0" distR="0" wp14:anchorId="4FD489E5" wp14:editId="2D8B48E1">
+            <wp:extent cx="5274310" cy="2966720"/>
+            <wp:effectExtent l="0" t="0" r="2540" b="5080"/>
+            <wp:docPr id="539554754" name="Graphic 1"/>
+            <wp:cNvGraphicFramePr>
+              <a:graphicFrameLocks xmlns:a="http://schemas.openxmlformats.org/drawingml/2006/main" noChangeAspect="1"/>
+            </wp:cNvGraphicFramePr>
+            <a:graphic xmlns:a="http://schemas.openxmlformats.org/drawingml/2006/main">
+              <a:graphicData uri="http://schemas.openxmlformats.org/drawingml/2006/picture">
+                <pic:pic xmlns:pic="http://schemas.openxmlformats.org/drawingml/2006/picture">
+                  <pic:nvPicPr>
+                    <pic:cNvPr id="539554754" name=""/>
+                    <pic:cNvPicPr/>
+                  </pic:nvPicPr>
+                  <pic:blipFill>
+                    <a:blip r:embed="rId24">
+                      <a:extLst>
+                        <a:ext uri="{96DAC541-7B7A-43D3-8B79-37D633B846F1}">
+                          <asvg:svgBlip xmlns:asvg="http://schemas.microsoft.com/office/drawing/2016/SVG/main" r:embed="rId25"/>
                         </a:ext>
                       </a:extLst>
                     </a:blip>

</xml_diff>